<commit_message>
Documento de la primera entrega de Algoritmos
</commit_message>
<xml_diff>
--- a/Documento_algoritmos_IEEE entregable.docx
+++ b/Documento_algoritmos_IEEE entregable.docx
@@ -36,45 +36,8 @@
           <w:lang w:val="es-MX"/>
         </w:rPr>
         <w:br/>
-        <w:t xml:space="preserve"> realizado por Asier Arguinzones y </w:t>
-      </w:r>
-      <w:proofErr w:type="spellStart"/>
-      <w:r>
-        <w:rPr>
-          <w:rFonts w:ascii="Times New Roman" w:hAnsi="Times New Roman" w:cs="Times New Roman"/>
-          <w:b/>
-          <w:bCs/>
-          <w:sz w:val="28"/>
-          <w:szCs w:val="28"/>
-          <w:lang w:val="es-MX"/>
-        </w:rPr>
-        <w:t>Andres</w:t>
-      </w:r>
-      <w:proofErr w:type="spellEnd"/>
-      <w:r>
-        <w:rPr>
-          <w:rFonts w:ascii="Times New Roman" w:hAnsi="Times New Roman" w:cs="Times New Roman"/>
-          <w:b/>
-          <w:bCs/>
-          <w:sz w:val="28"/>
-          <w:szCs w:val="28"/>
-          <w:lang w:val="es-MX"/>
-        </w:rPr>
-        <w:t xml:space="preserve"> Felipe </w:t>
-      </w:r>
-      <w:proofErr w:type="spellStart"/>
-      <w:r>
-        <w:rPr>
-          <w:rFonts w:ascii="Times New Roman" w:hAnsi="Times New Roman" w:cs="Times New Roman"/>
-          <w:b/>
-          <w:bCs/>
-          <w:sz w:val="28"/>
-          <w:szCs w:val="28"/>
-          <w:lang w:val="es-MX"/>
-        </w:rPr>
-        <w:t>Ortegon</w:t>
-      </w:r>
-      <w:proofErr w:type="spellEnd"/>
+        <w:t xml:space="preserve"> realizado por Asier Arguinzones y Andres Felipe Ortegon</w:t>
+      </w:r>
     </w:p>
     <w:p>
       <w:pPr>
@@ -774,25 +737,7 @@
           <w:sz w:val="20"/>
           <w:szCs w:val="20"/>
         </w:rPr>
-        <w:t xml:space="preserve">Se desarrollará en el entorno de </w:t>
-      </w:r>
-      <w:proofErr w:type="spellStart"/>
-      <w:r>
-        <w:rPr>
-          <w:rFonts w:ascii="Times New Roman" w:hAnsi="Times New Roman" w:cs="Times New Roman"/>
-          <w:sz w:val="20"/>
-          <w:szCs w:val="20"/>
-        </w:rPr>
-        <w:t>VSCode</w:t>
-      </w:r>
-      <w:proofErr w:type="spellEnd"/>
-      <w:r>
-        <w:rPr>
-          <w:rFonts w:ascii="Times New Roman" w:hAnsi="Times New Roman" w:cs="Times New Roman"/>
-          <w:sz w:val="20"/>
-          <w:szCs w:val="20"/>
-        </w:rPr>
-        <w:t>.</w:t>
+        <w:t>Se desarrollará en el entorno de VSCode.</w:t>
       </w:r>
     </w:p>
     <w:p>
@@ -1173,10 +1118,6 @@
     </w:p>
     <w:p>
       <w:pPr>
-        <w:numPr>
-          <w:ilvl w:val="0"/>
-          <w:numId w:val="29"/>
-        </w:numPr>
         <w:spacing w:line="240" w:lineRule="auto"/>
         <w:rPr>
           <w:rFonts w:ascii="Times New Roman" w:hAnsi="Times New Roman" w:cs="Times New Roman"/>
@@ -1192,25 +1133,35 @@
           <w:sz w:val="20"/>
           <w:szCs w:val="20"/>
         </w:rPr>
+        <w:t xml:space="preserve">-  </w:t>
+      </w:r>
+      <w:r>
+        <w:rPr>
+          <w:rFonts w:ascii="Times New Roman" w:hAnsi="Times New Roman" w:cs="Times New Roman"/>
+          <w:b/>
+          <w:bCs/>
+          <w:sz w:val="20"/>
+          <w:szCs w:val="20"/>
+        </w:rPr>
         <w:t>Precio</w:t>
       </w:r>
-      <w:r>
-        <w:rPr>
-          <w:rFonts w:ascii="Times New Roman" w:hAnsi="Times New Roman" w:cs="Times New Roman"/>
-          <w:sz w:val="20"/>
-          <w:szCs w:val="20"/>
-        </w:rPr>
-        <w:t xml:space="preserve"> </w:t>
-      </w:r>
-      <w:r>
-        <w:rPr>
-          <w:rFonts w:ascii="Times New Roman" w:hAnsi="Times New Roman" w:cs="Times New Roman"/>
-          <w:i/>
-          <w:iCs/>
-          <w:sz w:val="20"/>
-          <w:szCs w:val="20"/>
-        </w:rPr>
-        <w:t>(Pendiente de especificar)</w:t>
+    </w:p>
+    <w:p>
+      <w:pPr>
+        <w:spacing w:line="240" w:lineRule="auto"/>
+        <w:rPr>
+          <w:rFonts w:ascii="Times New Roman" w:hAnsi="Times New Roman" w:cs="Times New Roman"/>
+          <w:sz w:val="20"/>
+          <w:szCs w:val="20"/>
+        </w:rPr>
+      </w:pPr>
+      <w:r>
+        <w:rPr>
+          <w:rFonts w:ascii="Times New Roman" w:hAnsi="Times New Roman" w:cs="Times New Roman"/>
+          <w:sz w:val="20"/>
+          <w:szCs w:val="20"/>
+        </w:rPr>
+        <w:t>El precio de este proyecto será de 3.500.000 de pesos colombianos</w:t>
       </w:r>
     </w:p>
     <w:p>
@@ -1604,6 +1555,7 @@
           <w:sz w:val="20"/>
           <w:szCs w:val="20"/>
         </w:rPr>
+        <w:lastRenderedPageBreak/>
         <w:t>Cabe aclarar que cada tarea tendrá un encargado asignado y un tiempo límite para su realización.</w:t>
       </w:r>
     </w:p>
@@ -1626,7 +1578,6 @@
           <w:sz w:val="48"/>
           <w:szCs w:val="48"/>
         </w:rPr>
-        <w:lastRenderedPageBreak/>
         <w:t>2. Planeación</w:t>
       </w:r>
     </w:p>
@@ -3338,21 +3289,12 @@
           <w:szCs w:val="20"/>
         </w:rPr>
       </w:pPr>
-      <w:proofErr w:type="gramStart"/>
-      <w:r>
-        <w:rPr>
-          <w:sz w:val="20"/>
-          <w:szCs w:val="20"/>
-        </w:rPr>
-        <w:t>Asegurar</w:t>
-      </w:r>
-      <w:proofErr w:type="gramEnd"/>
-      <w:r>
-        <w:rPr>
-          <w:sz w:val="20"/>
-          <w:szCs w:val="20"/>
-        </w:rPr>
-        <w:t xml:space="preserve"> que la pantalla cargue rápido y funcione de manera fluida al mostrar los datos.</w:t>
+      <w:r>
+        <w:rPr>
+          <w:sz w:val="20"/>
+          <w:szCs w:val="20"/>
+        </w:rPr>
+        <w:t>Asegurar que la pantalla cargue rápido y funcione de manera fluida al mostrar los datos.</w:t>
       </w:r>
     </w:p>
     <w:p>
@@ -3554,21 +3496,12 @@
           <w:szCs w:val="20"/>
         </w:rPr>
       </w:pPr>
-      <w:proofErr w:type="gramStart"/>
-      <w:r>
-        <w:rPr>
-          <w:sz w:val="20"/>
-          <w:szCs w:val="20"/>
-        </w:rPr>
-        <w:t>Asegurar</w:t>
-      </w:r>
-      <w:proofErr w:type="gramEnd"/>
-      <w:r>
-        <w:rPr>
-          <w:sz w:val="20"/>
-          <w:szCs w:val="20"/>
-        </w:rPr>
-        <w:t xml:space="preserve"> que al mover o cambiar de nombre una categoría, sus subcategorías se actualicen correctamente y sigan ordenadas.</w:t>
+      <w:r>
+        <w:rPr>
+          <w:sz w:val="20"/>
+          <w:szCs w:val="20"/>
+        </w:rPr>
+        <w:t>Asegurar que al mover o cambiar de nombre una categoría, sus subcategorías se actualicen correctamente y sigan ordenadas.</w:t>
       </w:r>
     </w:p>
     <w:p>
@@ -4134,7 +4067,6 @@
     <w:p>
       <w:pPr>
         <w:spacing w:line="240" w:lineRule="auto"/>
-        <w:jc w:val="both"/>
         <w:rPr>
           <w:rFonts w:ascii="Times New Roman" w:hAnsi="Times New Roman" w:cs="Times New Roman"/>
           <w:b/>
@@ -8885,6 +8817,7 @@
   <w:style w:type="character" w:default="1" w:styleId="Fuentedeprrafopredeter">
     <w:name w:val="Default Paragraph Font"/>
     <w:uiPriority w:val="1"/>
+    <w:semiHidden/>
     <w:unhideWhenUsed/>
   </w:style>
   <w:style w:type="table" w:default="1" w:styleId="Tablanormal">

</xml_diff>